<commit_message>
Add README, update docx, rename screenshots
</commit_message>
<xml_diff>
--- a/CyberSecurity_Assessment11_ICMPFlood_Haider.docx
+++ b/CyberSecurity_Assessment11_ICMPFlood_Haider.docx
@@ -31,73 +31,7 @@
           <w:szCs w:val="36"/>
           <w:lang w:val="en-GB" w:eastAsia="en-GB"/>
         </w:rPr>
-        <w:t xml:space="preserve">    </w:t>
-      </w:r>
-      <w:r>
-        <w:rPr>
-          <w:b/>
-          <w:bCs/>
-          <w:noProof/>
-          <w:sz w:val="36"/>
-          <w:szCs w:val="36"/>
-          <w:lang w:val="en-GB" w:eastAsia="en-GB"/>
-        </w:rPr>
-        <w:drawing>
-          <wp:inline distT="0" distB="0" distL="0" distR="0" wp14:anchorId="1776645E" wp14:editId="54CDC3E4">
-            <wp:extent cx="690033" cy="499737"/>
-            <wp:effectExtent l="0" t="0" r="0" b="0"/>
-            <wp:docPr id="1" name="Picture 1"/>
-            <wp:cNvGraphicFramePr>
-              <a:graphicFrameLocks xmlns:a="http://schemas.openxmlformats.org/drawingml/2006/main" noChangeAspect="1"/>
-            </wp:cNvGraphicFramePr>
-            <a:graphic xmlns:a="http://schemas.openxmlformats.org/drawingml/2006/main">
-              <a:graphicData uri="http://schemas.openxmlformats.org/drawingml/2006/picture">
-                <pic:pic xmlns:pic="http://schemas.openxmlformats.org/drawingml/2006/picture">
-                  <pic:nvPicPr>
-                    <pic:cNvPr id="0" name="Picture 2"/>
-                    <pic:cNvPicPr>
-                      <a:picLocks noChangeAspect="1" noChangeArrowheads="1"/>
-                    </pic:cNvPicPr>
-                  </pic:nvPicPr>
-                  <pic:blipFill>
-                    <a:blip r:embed="rId5" cstate="print">
-                      <a:extLst>
-                        <a:ext uri="{28A0092B-C50C-407E-A947-70E740481C1C}">
-                          <a14:useLocalDpi xmlns:a14="http://schemas.microsoft.com/office/drawing/2010/main" val="0"/>
-                        </a:ext>
-                      </a:extLst>
-                    </a:blip>
-                    <a:srcRect/>
-                    <a:stretch>
-                      <a:fillRect/>
-                    </a:stretch>
-                  </pic:blipFill>
-                  <pic:spPr bwMode="auto">
-                    <a:xfrm>
-                      <a:off x="0" y="0"/>
-                      <a:ext cx="713244" cy="516547"/>
-                    </a:xfrm>
-                    <a:prstGeom prst="rect">
-                      <a:avLst/>
-                    </a:prstGeom>
-                    <a:noFill/>
-                  </pic:spPr>
-                </pic:pic>
-              </a:graphicData>
-            </a:graphic>
-          </wp:inline>
-        </w:drawing>
-      </w:r>
-      <w:r>
-        <w:rPr>
-          <w:b/>
-          <w:bCs/>
-          <w:noProof/>
-          <w:sz w:val="36"/>
-          <w:szCs w:val="36"/>
-          <w:lang w:val="en-GB" w:eastAsia="en-GB"/>
-        </w:rPr>
-        <w:t xml:space="preserve">                                                                     </w:t>
+        <w:t xml:space="preserve">                                                                  </w:t>
       </w:r>
       <w:r>
         <w:rPr>
@@ -186,7 +120,7 @@
                     </pic:cNvPicPr>
                   </pic:nvPicPr>
                   <pic:blipFill>
-                    <a:blip r:embed="rId6">
+                    <a:blip r:embed="rId5">
                       <a:extLst>
                         <a:ext uri="{28A0092B-C50C-407E-A947-70E740481C1C}">
                           <a14:useLocalDpi xmlns:a14="http://schemas.microsoft.com/office/drawing/2010/main" val="0"/>
@@ -212,18 +146,15 @@
           </wp:anchor>
         </w:drawing>
       </w:r>
-    </w:p>
-    <w:p>
-      <w:pPr>
-        <w:pStyle w:val="Default"/>
-        <w:jc w:val="center"/>
+      <w:r>
         <w:rPr>
           <w:b/>
           <w:bCs/>
           <w:sz w:val="36"/>
           <w:szCs w:val="36"/>
         </w:rPr>
-      </w:pPr>
+        <w:t xml:space="preserve">Cyber Security </w:t>
+      </w:r>
       <w:r>
         <w:rPr>
           <w:b/>
@@ -231,300 +162,30 @@
           <w:sz w:val="36"/>
           <w:szCs w:val="36"/>
         </w:rPr>
-        <w:t xml:space="preserve">Cyber Security </w:t>
-      </w:r>
-      <w:r>
+        <w:t>Lab</w:t>
+      </w:r>
+    </w:p>
+    <w:p>
+      <w:pPr>
+        <w:pStyle w:val="Default"/>
+        <w:jc w:val="center"/>
         <w:rPr>
           <w:b/>
           <w:bCs/>
           <w:sz w:val="36"/>
           <w:szCs w:val="36"/>
         </w:rPr>
-        <w:t xml:space="preserve">– Assessment # </w:t>
-      </w:r>
-      <w:r>
+      </w:pPr>
+    </w:p>
+    <w:p>
+      <w:pPr>
         <w:rPr>
           <w:b/>
           <w:bCs/>
-          <w:sz w:val="36"/>
-          <w:szCs w:val="36"/>
-        </w:rPr>
-        <w:t>1</w:t>
-      </w:r>
-      <w:r>
-        <w:rPr>
-          <w:b/>
-          <w:bCs/>
-          <w:sz w:val="36"/>
-          <w:szCs w:val="36"/>
-        </w:rPr>
-        <w:t>1</w:t>
-      </w:r>
-    </w:p>
-    <w:p>
-      <w:pPr>
-        <w:pStyle w:val="Default"/>
-        <w:jc w:val="center"/>
-        <w:rPr>
-          <w:b/>
-          <w:bCs/>
-          <w:sz w:val="36"/>
-          <w:szCs w:val="36"/>
-        </w:rPr>
-      </w:pPr>
-    </w:p>
-    <w:p>
-      <w:pPr>
-        <w:rPr>
-          <w:rFonts w:cstheme="minorHAnsi"/>
-          <w:sz w:val="28"/>
-          <w:szCs w:val="28"/>
-        </w:rPr>
-      </w:pPr>
-      <w:r>
-        <w:rPr>
-          <w:rFonts w:cstheme="minorHAnsi"/>
-          <w:sz w:val="28"/>
-          <w:szCs w:val="28"/>
-        </w:rPr>
-        <w:t xml:space="preserve">Week </w:t>
-      </w:r>
-      <w:r>
-        <w:rPr>
-          <w:rFonts w:cstheme="minorHAnsi"/>
-          <w:sz w:val="28"/>
-          <w:szCs w:val="28"/>
-        </w:rPr>
-        <w:t>1</w:t>
-      </w:r>
-      <w:r>
-        <w:rPr>
-          <w:rFonts w:cstheme="minorHAnsi"/>
-          <w:sz w:val="28"/>
-          <w:szCs w:val="28"/>
-        </w:rPr>
-        <w:t>1</w:t>
-      </w:r>
-      <w:r>
-        <w:rPr>
-          <w:rFonts w:cstheme="minorHAnsi"/>
-          <w:sz w:val="28"/>
-          <w:szCs w:val="28"/>
-        </w:rPr>
-        <w:tab/>
-      </w:r>
-      <w:r>
-        <w:rPr>
-          <w:rFonts w:cstheme="minorHAnsi"/>
-          <w:sz w:val="28"/>
-          <w:szCs w:val="28"/>
-        </w:rPr>
-        <w:tab/>
-      </w:r>
-      <w:r>
-        <w:rPr>
-          <w:rFonts w:cstheme="minorHAnsi"/>
-          <w:sz w:val="28"/>
-          <w:szCs w:val="28"/>
-        </w:rPr>
-        <w:tab/>
-      </w:r>
-      <w:r>
-        <w:rPr>
-          <w:rFonts w:cstheme="minorHAnsi"/>
-          <w:sz w:val="28"/>
-          <w:szCs w:val="28"/>
-        </w:rPr>
-        <w:tab/>
-      </w:r>
-      <w:r>
-        <w:rPr>
-          <w:rFonts w:cstheme="minorHAnsi"/>
-          <w:sz w:val="28"/>
-          <w:szCs w:val="28"/>
-        </w:rPr>
-        <w:tab/>
-      </w:r>
-      <w:r>
-        <w:rPr>
-          <w:rFonts w:cstheme="minorHAnsi"/>
-          <w:sz w:val="28"/>
-          <w:szCs w:val="28"/>
-        </w:rPr>
-        <w:tab/>
-      </w:r>
-      <w:r>
-        <w:rPr>
-          <w:rFonts w:cstheme="minorHAnsi"/>
-          <w:sz w:val="28"/>
-          <w:szCs w:val="28"/>
-        </w:rPr>
-        <w:tab/>
-      </w:r>
-      <w:r>
-        <w:rPr>
-          <w:rFonts w:cstheme="minorHAnsi"/>
-          <w:sz w:val="28"/>
-          <w:szCs w:val="28"/>
-        </w:rPr>
-        <w:t xml:space="preserve"> </w:t>
-      </w:r>
-      <w:r>
-        <w:rPr>
-          <w:rFonts w:cstheme="minorHAnsi"/>
-          <w:sz w:val="28"/>
-          <w:szCs w:val="28"/>
-        </w:rPr>
-        <w:tab/>
-      </w:r>
-      <w:r>
-        <w:rPr>
-          <w:rFonts w:cstheme="minorHAnsi"/>
-          <w:sz w:val="28"/>
-          <w:szCs w:val="28"/>
-        </w:rPr>
-        <w:t xml:space="preserve">Time: </w:t>
-      </w:r>
-      <w:r>
-        <w:rPr>
-          <w:rFonts w:cstheme="minorHAnsi"/>
-          <w:sz w:val="28"/>
-          <w:szCs w:val="28"/>
-        </w:rPr>
-        <w:t>2</w:t>
-      </w:r>
-      <w:r>
-        <w:rPr>
-          <w:rFonts w:cstheme="minorHAnsi"/>
-          <w:sz w:val="28"/>
-          <w:szCs w:val="28"/>
-        </w:rPr>
-        <w:t xml:space="preserve"> - Hours</w:t>
-      </w:r>
-    </w:p>
-    <w:p>
-      <w:pPr>
-        <w:rPr>
-          <w:rFonts w:cstheme="minorHAnsi"/>
-          <w:sz w:val="18"/>
-          <w:szCs w:val="18"/>
-        </w:rPr>
-      </w:pPr>
-      <w:r>
-        <w:rPr>
-          <w:rFonts w:cstheme="minorHAnsi"/>
-          <w:sz w:val="28"/>
-          <w:szCs w:val="28"/>
-        </w:rPr>
-        <w:t>Name:</w:t>
-      </w:r>
-      <w:r>
-        <w:rPr>
-          <w:rFonts w:cstheme="minorHAnsi"/>
-          <w:sz w:val="28"/>
-          <w:szCs w:val="28"/>
-        </w:rPr>
-        <w:t xml:space="preserve"> Haider Jamal   </w:t>
-      </w:r>
-      <w:r>
-        <w:rPr>
-          <w:rFonts w:cstheme="minorHAnsi"/>
-          <w:sz w:val="28"/>
-          <w:szCs w:val="28"/>
-        </w:rPr>
-        <w:tab/>
-      </w:r>
-      <w:r>
-        <w:rPr>
-          <w:rFonts w:cstheme="minorHAnsi"/>
-          <w:sz w:val="28"/>
-          <w:szCs w:val="28"/>
-        </w:rPr>
-        <w:tab/>
-      </w:r>
-      <w:r>
-        <w:rPr>
-          <w:rFonts w:cstheme="minorHAnsi"/>
-          <w:sz w:val="28"/>
-          <w:szCs w:val="28"/>
-        </w:rPr>
-        <w:tab/>
-      </w:r>
-      <w:r>
-        <w:rPr>
-          <w:rFonts w:cstheme="minorHAnsi"/>
-          <w:sz w:val="28"/>
-          <w:szCs w:val="28"/>
-        </w:rPr>
-        <w:tab/>
-      </w:r>
-      <w:r>
-        <w:rPr>
-          <w:rFonts w:cstheme="minorHAnsi"/>
-          <w:sz w:val="28"/>
-          <w:szCs w:val="28"/>
-        </w:rPr>
-        <w:tab/>
-      </w:r>
-      <w:r>
-        <w:rPr>
-          <w:rFonts w:cstheme="minorHAnsi"/>
-          <w:sz w:val="28"/>
-          <w:szCs w:val="28"/>
-        </w:rPr>
-        <w:tab/>
-      </w:r>
-      <w:r>
-        <w:rPr>
-          <w:rFonts w:cstheme="minorHAnsi"/>
-          <w:sz w:val="28"/>
-          <w:szCs w:val="28"/>
-        </w:rPr>
-        <w:t xml:space="preserve">Marks: </w:t>
-      </w:r>
-      <w:r>
-        <w:rPr>
-          <w:rFonts w:cstheme="minorHAnsi"/>
-          <w:sz w:val="28"/>
-          <w:szCs w:val="28"/>
-        </w:rPr>
-        <w:t>1</w:t>
-      </w:r>
-      <w:r>
-        <w:rPr>
-          <w:rFonts w:cstheme="minorHAnsi"/>
-          <w:sz w:val="28"/>
-          <w:szCs w:val="28"/>
-        </w:rPr>
-        <w:t>0</w:t>
-      </w:r>
-      <w:r>
-        <w:rPr>
-          <w:rFonts w:cstheme="minorHAnsi"/>
-          <w:sz w:val="28"/>
-          <w:szCs w:val="28"/>
-        </w:rPr>
-        <w:t>0</w:t>
-      </w:r>
-    </w:p>
-    <w:p>
-      <w:pPr>
-        <w:rPr>
-          <w:b/>
-          <w:bCs/>
-          <w:sz w:val="28"/>
-          <w:szCs w:val="28"/>
-        </w:rPr>
-      </w:pPr>
-      <w:r>
-        <w:rPr>
-          <w:b/>
-          <w:bCs/>
-          <w:sz w:val="28"/>
-          <w:szCs w:val="28"/>
-        </w:rPr>
-        <w:t xml:space="preserve"> </w:t>
-      </w:r>
+          <w:sz w:val="28"/>
+          <w:szCs w:val="28"/>
+        </w:rPr>
+      </w:pPr>
     </w:p>
     <w:p>
       <w:pPr>
@@ -538,16 +199,6 @@
           <w:szCs w:val="28"/>
         </w:rPr>
       </w:pPr>
-      <w:r>
-        <w:rPr>
-          <w:rFonts w:asciiTheme="minorHAnsi" w:hAnsiTheme="minorHAnsi" w:cstheme="minorHAnsi"/>
-          <w:b/>
-          <w:bCs/>
-          <w:sz w:val="28"/>
-          <w:szCs w:val="28"/>
-        </w:rPr>
-        <w:t>Q</w:t>
-      </w:r>
       <w:r>
         <w:rPr>
           <w:rFonts w:asciiTheme="minorHAnsi" w:hAnsiTheme="minorHAnsi" w:cstheme="minorHAnsi"/>
@@ -678,27 +329,7 @@
           <w:sz w:val="28"/>
           <w:szCs w:val="28"/>
         </w:rPr>
-        <w:t xml:space="preserve">Launched using </w:t>
-      </w:r>
-      <w:proofErr w:type="spellStart"/>
-      <w:r>
-        <w:rPr>
-          <w:rFonts w:cstheme="minorHAnsi"/>
-          <w:color w:val="0F1115"/>
-          <w:sz w:val="28"/>
-          <w:szCs w:val="28"/>
-        </w:rPr>
-        <w:t>pentmenu's</w:t>
-      </w:r>
-      <w:proofErr w:type="spellEnd"/>
-      <w:r>
-        <w:rPr>
-          <w:rFonts w:cstheme="minorHAnsi"/>
-          <w:color w:val="0F1115"/>
-          <w:sz w:val="28"/>
-          <w:szCs w:val="28"/>
-        </w:rPr>
-        <w:t xml:space="preserve"> ICMP Echo Flood module (hping3 backend), targeting the Windows victim VM (150.1.7.102) from Kali (150.1.7.101) with the real source IP.</w:t>
+        <w:t>Launched using pentmenu's ICMP Echo Flood module (hping3 backend), targeting the Windows victim VM (150.1.7.102) from Kali (150.1.7.101) with the real source IP.</w:t>
       </w:r>
     </w:p>
     <w:p>
@@ -717,25 +348,14 @@
           <w:szCs w:val="28"/>
         </w:rPr>
       </w:pPr>
-      <w:proofErr w:type="spellStart"/>
-      <w:r>
-        <w:rPr>
-          <w:rFonts w:cstheme="minorHAnsi"/>
-          <w:color w:val="0F1115"/>
-          <w:sz w:val="28"/>
-          <w:szCs w:val="28"/>
-        </w:rPr>
-        <w:t>Pentmenu</w:t>
-      </w:r>
-      <w:proofErr w:type="spellEnd"/>
-      <w:r>
-        <w:rPr>
-          <w:rFonts w:cstheme="minorHAnsi"/>
-          <w:color w:val="0F1115"/>
-          <w:sz w:val="28"/>
-          <w:szCs w:val="28"/>
-        </w:rPr>
-        <w:t>&gt;2 → 1</w:t>
+      <w:r>
+        <w:rPr>
+          <w:rFonts w:cstheme="minorHAnsi"/>
+          <w:color w:val="0F1115"/>
+          <w:sz w:val="28"/>
+          <w:szCs w:val="28"/>
+        </w:rPr>
+        <w:t>Pentmenu&gt;2 → 1</w:t>
       </w:r>
     </w:p>
     <w:p>
@@ -912,7 +532,7 @@
                     </pic:cNvPicPr>
                   </pic:nvPicPr>
                   <pic:blipFill>
-                    <a:blip r:embed="rId7">
+                    <a:blip r:embed="rId6">
                       <a:extLst>
                         <a:ext uri="{28A0092B-C50C-407E-A947-70E740481C1C}">
                           <a14:useLocalDpi xmlns:a14="http://schemas.microsoft.com/office/drawing/2010/main" val="0"/>
@@ -991,7 +611,7 @@
                     </pic:cNvPicPr>
                   </pic:nvPicPr>
                   <pic:blipFill>
-                    <a:blip r:embed="rId8">
+                    <a:blip r:embed="rId7">
                       <a:extLst>
                         <a:ext uri="{28A0092B-C50C-407E-A947-70E740481C1C}">
                           <a14:useLocalDpi xmlns:a14="http://schemas.microsoft.com/office/drawing/2010/main" val="0"/>
@@ -1071,7 +691,7 @@
                     </pic:cNvPicPr>
                   </pic:nvPicPr>
                   <pic:blipFill>
-                    <a:blip r:embed="rId9">
+                    <a:blip r:embed="rId8">
                       <a:extLst>
                         <a:ext uri="{28A0092B-C50C-407E-A947-70E740481C1C}">
                           <a14:useLocalDpi xmlns:a14="http://schemas.microsoft.com/office/drawing/2010/main" val="0"/>
@@ -1137,31 +757,7 @@
           <w:sz w:val="28"/>
           <w:szCs w:val="28"/>
         </w:rPr>
-        <w:t xml:space="preserve">Method 2: ICMP </w:t>
-      </w:r>
-      <w:proofErr w:type="spellStart"/>
-      <w:r>
-        <w:rPr>
-          <w:rFonts w:cstheme="minorHAnsi"/>
-          <w:b/>
-          <w:bCs/>
-          <w:color w:val="0F1115"/>
-          <w:sz w:val="28"/>
-          <w:szCs w:val="28"/>
-        </w:rPr>
-        <w:t>Blacknurse</w:t>
-      </w:r>
-      <w:proofErr w:type="spellEnd"/>
-      <w:r>
-        <w:rPr>
-          <w:rFonts w:cstheme="minorHAnsi"/>
-          <w:b/>
-          <w:bCs/>
-          <w:color w:val="0F1115"/>
-          <w:sz w:val="28"/>
-          <w:szCs w:val="28"/>
-        </w:rPr>
-        <w:t xml:space="preserve"> Flood</w:t>
+        <w:t>Method 2: ICMP Blacknurse Flood</w:t>
       </w:r>
     </w:p>
     <w:p>
@@ -1183,47 +779,7 @@
           <w:sz w:val="28"/>
           <w:szCs w:val="28"/>
         </w:rPr>
-        <w:t xml:space="preserve">Used </w:t>
-      </w:r>
-      <w:proofErr w:type="spellStart"/>
-      <w:r>
-        <w:rPr>
-          <w:rFonts w:cstheme="minorHAnsi"/>
-          <w:color w:val="0F1115"/>
-          <w:sz w:val="28"/>
-          <w:szCs w:val="28"/>
-        </w:rPr>
-        <w:t>pentmenu's</w:t>
-      </w:r>
-      <w:proofErr w:type="spellEnd"/>
-      <w:r>
-        <w:rPr>
-          <w:rFonts w:cstheme="minorHAnsi"/>
-          <w:color w:val="0F1115"/>
-          <w:sz w:val="28"/>
-          <w:szCs w:val="28"/>
-        </w:rPr>
-        <w:t xml:space="preserve"> ICMP </w:t>
-      </w:r>
-      <w:proofErr w:type="spellStart"/>
-      <w:r>
-        <w:rPr>
-          <w:rFonts w:cstheme="minorHAnsi"/>
-          <w:color w:val="0F1115"/>
-          <w:sz w:val="28"/>
-          <w:szCs w:val="28"/>
-        </w:rPr>
-        <w:t>Blacknurse</w:t>
-      </w:r>
-      <w:proofErr w:type="spellEnd"/>
-      <w:r>
-        <w:rPr>
-          <w:rFonts w:cstheme="minorHAnsi"/>
-          <w:color w:val="0F1115"/>
-          <w:sz w:val="28"/>
-          <w:szCs w:val="28"/>
-        </w:rPr>
-        <w:t xml:space="preserve"> module, which sends ICMP Type 3 (Destination Unreachable), Code 3 (Port Unreachable) packets instead of standard Echo Requests.</w:t>
+        <w:t>Used pentmenu's ICMP Blacknurse module, which sends ICMP Type 3 (Destination Unreachable), Code 3 (Port Unreachable) packets instead of standard Echo Requests.</w:t>
       </w:r>
     </w:p>
     <w:p>
@@ -1242,25 +798,14 @@
           <w:szCs w:val="28"/>
         </w:rPr>
       </w:pPr>
-      <w:proofErr w:type="spellStart"/>
-      <w:r>
-        <w:rPr>
-          <w:rFonts w:cstheme="minorHAnsi"/>
-          <w:color w:val="0F1115"/>
-          <w:sz w:val="28"/>
-          <w:szCs w:val="28"/>
-        </w:rPr>
-        <w:t>Pentmenu</w:t>
-      </w:r>
-      <w:proofErr w:type="spellEnd"/>
-      <w:r>
-        <w:rPr>
-          <w:rFonts w:cstheme="minorHAnsi"/>
-          <w:color w:val="0F1115"/>
-          <w:sz w:val="28"/>
-          <w:szCs w:val="28"/>
-        </w:rPr>
-        <w:t>&gt;2 → 2</w:t>
+      <w:r>
+        <w:rPr>
+          <w:rFonts w:cstheme="minorHAnsi"/>
+          <w:color w:val="0F1115"/>
+          <w:sz w:val="28"/>
+          <w:szCs w:val="28"/>
+        </w:rPr>
+        <w:t>Pentmenu&gt;2 → 2</w:t>
       </w:r>
     </w:p>
     <w:p>
@@ -1385,7 +930,7 @@
                     </pic:cNvPicPr>
                   </pic:nvPicPr>
                   <pic:blipFill>
-                    <a:blip r:embed="rId10">
+                    <a:blip r:embed="rId9">
                       <a:extLst>
                         <a:ext uri="{28A0092B-C50C-407E-A947-70E740481C1C}">
                           <a14:useLocalDpi xmlns:a14="http://schemas.microsoft.com/office/drawing/2010/main" val="0"/>
@@ -1451,7 +996,7 @@
                     </pic:cNvPicPr>
                   </pic:nvPicPr>
                   <pic:blipFill>
-                    <a:blip r:embed="rId11">
+                    <a:blip r:embed="rId10">
                       <a:extLst>
                         <a:ext uri="{28A0092B-C50C-407E-A947-70E740481C1C}">
                           <a14:useLocalDpi xmlns:a14="http://schemas.microsoft.com/office/drawing/2010/main" val="0"/>
@@ -1518,7 +1063,7 @@
                     </pic:cNvPicPr>
                   </pic:nvPicPr>
                   <pic:blipFill>
-                    <a:blip r:embed="rId12">
+                    <a:blip r:embed="rId11">
                       <a:extLst>
                         <a:ext uri="{28A0092B-C50C-407E-A947-70E740481C1C}">
                           <a14:useLocalDpi xmlns:a14="http://schemas.microsoft.com/office/drawing/2010/main" val="0"/>
@@ -1639,25 +1184,14 @@
           <w:szCs w:val="28"/>
         </w:rPr>
       </w:pPr>
-      <w:proofErr w:type="spellStart"/>
-      <w:r>
-        <w:rPr>
-          <w:rFonts w:cstheme="minorHAnsi"/>
-          <w:color w:val="0F1115"/>
-          <w:sz w:val="28"/>
-          <w:szCs w:val="28"/>
-        </w:rPr>
-        <w:t>Pentmenu</w:t>
-      </w:r>
-      <w:proofErr w:type="spellEnd"/>
-      <w:r>
-        <w:rPr>
-          <w:rFonts w:cstheme="minorHAnsi"/>
-          <w:color w:val="0F1115"/>
-          <w:sz w:val="28"/>
-          <w:szCs w:val="28"/>
-        </w:rPr>
-        <w:t>&gt;2 → 1</w:t>
+      <w:r>
+        <w:rPr>
+          <w:rFonts w:cstheme="minorHAnsi"/>
+          <w:color w:val="0F1115"/>
+          <w:sz w:val="28"/>
+          <w:szCs w:val="28"/>
+        </w:rPr>
+        <w:t>Pentmenu&gt;2 → 1</w:t>
       </w:r>
     </w:p>
     <w:p>
@@ -1781,7 +1315,7 @@
                     </pic:cNvPicPr>
                   </pic:nvPicPr>
                   <pic:blipFill>
-                    <a:blip r:embed="rId13">
+                    <a:blip r:embed="rId12">
                       <a:extLst>
                         <a:ext uri="{28A0092B-C50C-407E-A947-70E740481C1C}">
                           <a14:useLocalDpi xmlns:a14="http://schemas.microsoft.com/office/drawing/2010/main" val="0"/>
@@ -1848,7 +1382,7 @@
                     </pic:cNvPicPr>
                   </pic:nvPicPr>
                   <pic:blipFill>
-                    <a:blip r:embed="rId14">
+                    <a:blip r:embed="rId13">
                       <a:extLst>
                         <a:ext uri="{28A0092B-C50C-407E-A947-70E740481C1C}">
                           <a14:useLocalDpi xmlns:a14="http://schemas.microsoft.com/office/drawing/2010/main" val="0"/>
@@ -1914,7 +1448,7 @@
                     </pic:cNvPicPr>
                   </pic:nvPicPr>
                   <pic:blipFill>
-                    <a:blip r:embed="rId15">
+                    <a:blip r:embed="rId14">
                       <a:extLst>
                         <a:ext uri="{28A0092B-C50C-407E-A947-70E740481C1C}">
                           <a14:useLocalDpi xmlns:a14="http://schemas.microsoft.com/office/drawing/2010/main" val="0"/>
@@ -1973,14 +1507,12 @@
     <w:p>
       <w:pPr>
         <w:pStyle w:val="ds-markdown-paragraph"/>
-        <w:numPr>
-          <w:ilvl w:val="0"/>
-          <w:numId w:val="14"/>
-        </w:numPr>
         <w:shd w:val="clear" w:color="auto" w:fill="FFFFFF"/>
         <w:spacing w:before="0" w:beforeAutospacing="0" w:after="0" w:afterAutospacing="0" w:line="360" w:lineRule="auto"/>
         <w:rPr>
           <w:rFonts w:asciiTheme="minorHAnsi" w:hAnsiTheme="minorHAnsi" w:cstheme="minorHAnsi"/>
+          <w:b/>
+          <w:bCs/>
           <w:color w:val="0F1115"/>
           <w:sz w:val="28"/>
           <w:szCs w:val="28"/>
@@ -1989,47 +1521,25 @@
       <w:r>
         <w:rPr>
           <w:rFonts w:asciiTheme="minorHAnsi" w:hAnsiTheme="minorHAnsi" w:cstheme="minorHAnsi"/>
+          <w:b/>
+          <w:bCs/>
           <w:color w:val="0F1115"/>
           <w:sz w:val="28"/>
           <w:szCs w:val="28"/>
         </w:rPr>
         <w:lastRenderedPageBreak/>
+        <w:t>2.</w:t>
+      </w:r>
+      <w:r>
+        <w:rPr>
+          <w:rFonts w:asciiTheme="minorHAnsi" w:hAnsiTheme="minorHAnsi" w:cstheme="minorHAnsi"/>
+          <w:b/>
+          <w:bCs/>
+          <w:color w:val="0F1115"/>
+          <w:sz w:val="28"/>
+          <w:szCs w:val="28"/>
+        </w:rPr>
         <w:t>Block the attack using 3 different defensive techniques.</w:t>
-      </w:r>
-    </w:p>
-    <w:p>
-      <w:pPr>
-        <w:pStyle w:val="ds-markdown-paragraph"/>
-        <w:numPr>
-          <w:ilvl w:val="0"/>
-          <w:numId w:val="14"/>
-        </w:numPr>
-        <w:shd w:val="clear" w:color="auto" w:fill="FFFFFF"/>
-        <w:spacing w:before="0" w:beforeAutospacing="0" w:after="0" w:afterAutospacing="0" w:line="360" w:lineRule="auto"/>
-        <w:rPr>
-          <w:rFonts w:asciiTheme="minorHAnsi" w:hAnsiTheme="minorHAnsi" w:cstheme="minorHAnsi"/>
-          <w:color w:val="0F1115"/>
-          <w:sz w:val="28"/>
-          <w:szCs w:val="28"/>
-        </w:rPr>
-      </w:pPr>
-      <w:r>
-        <w:rPr>
-          <w:rFonts w:asciiTheme="minorHAnsi" w:hAnsiTheme="minorHAnsi" w:cstheme="minorHAnsi"/>
-          <w:color w:val="0F1115"/>
-          <w:sz w:val="28"/>
-          <w:szCs w:val="28"/>
-        </w:rPr>
-        <w:t>Defensive products may be purchased; budget is unlimited</w:t>
-      </w:r>
-      <w:r>
-        <w:rPr>
-          <w:rFonts w:asciiTheme="minorHAnsi" w:hAnsiTheme="minorHAnsi" w:cstheme="minorHAnsi"/>
-          <w:color w:val="0F1115"/>
-          <w:sz w:val="28"/>
-          <w:szCs w:val="28"/>
-        </w:rPr>
-        <w:t>.</w:t>
       </w:r>
     </w:p>
     <w:p>
@@ -2051,6 +1561,15 @@
           <w:sz w:val="28"/>
           <w:szCs w:val="28"/>
         </w:rPr>
+        <w:t xml:space="preserve">   </w:t>
+      </w:r>
+      <w:r>
+        <w:rPr>
+          <w:rFonts w:asciiTheme="minorHAnsi" w:hAnsiTheme="minorHAnsi" w:cstheme="minorHAnsi"/>
+          <w:color w:val="0F1115"/>
+          <w:sz w:val="28"/>
+          <w:szCs w:val="28"/>
+        </w:rPr>
         <w:t>Answer:</w:t>
       </w:r>
     </w:p>
@@ -2072,11 +1591,9 @@
           <w:sz w:val="28"/>
           <w:szCs w:val="28"/>
         </w:rPr>
-        <w:t>Part B: Defense — 3 Techniques</w:t>
-      </w:r>
-    </w:p>
-    <w:p>
-      <w:pPr>
+        <w:t xml:space="preserve">    </w:t>
+      </w:r>
+      <w:r>
         <w:rPr>
           <w:rFonts w:ascii="Times New Roman" w:hAnsi="Times New Roman" w:cs="Times New Roman"/>
           <w:b/>
@@ -2084,7 +1601,29 @@
           <w:sz w:val="28"/>
           <w:szCs w:val="28"/>
         </w:rPr>
-      </w:pPr>
+        <w:t>Part B: Defense — 3 Techniques</w:t>
+      </w:r>
+    </w:p>
+    <w:p>
+      <w:pPr>
+        <w:rPr>
+          <w:rFonts w:ascii="Times New Roman" w:hAnsi="Times New Roman" w:cs="Times New Roman"/>
+          <w:b/>
+          <w:bCs/>
+          <w:sz w:val="28"/>
+          <w:szCs w:val="28"/>
+        </w:rPr>
+      </w:pPr>
+      <w:r>
+        <w:rPr>
+          <w:rFonts w:ascii="Times New Roman" w:hAnsi="Times New Roman" w:cs="Times New Roman"/>
+          <w:b/>
+          <w:bCs/>
+          <w:sz w:val="28"/>
+          <w:szCs w:val="28"/>
+        </w:rPr>
+        <w:t xml:space="preserve">    </w:t>
+      </w:r>
       <w:r>
         <w:rPr>
           <w:rFonts w:ascii="Times New Roman" w:hAnsi="Times New Roman" w:cs="Times New Roman"/>
@@ -2132,95 +1671,13 @@
           <w:szCs w:val="28"/>
         </w:rPr>
       </w:pPr>
-      <w:proofErr w:type="spellStart"/>
-      <w:r>
-        <w:rPr>
-          <w:rFonts w:cstheme="minorHAnsi"/>
-          <w:sz w:val="28"/>
-          <w:szCs w:val="28"/>
-        </w:rPr>
-        <w:t>netsh</w:t>
-      </w:r>
-      <w:proofErr w:type="spellEnd"/>
-      <w:r>
-        <w:rPr>
-          <w:rFonts w:cstheme="minorHAnsi"/>
-          <w:sz w:val="28"/>
-          <w:szCs w:val="28"/>
-        </w:rPr>
-        <w:t xml:space="preserve"> </w:t>
-      </w:r>
-      <w:proofErr w:type="spellStart"/>
-      <w:r>
-        <w:rPr>
-          <w:rFonts w:cstheme="minorHAnsi"/>
-          <w:sz w:val="28"/>
-          <w:szCs w:val="28"/>
-        </w:rPr>
-        <w:t>advfirewall</w:t>
-      </w:r>
-      <w:proofErr w:type="spellEnd"/>
-      <w:r>
-        <w:rPr>
-          <w:rFonts w:cstheme="minorHAnsi"/>
-          <w:sz w:val="28"/>
-          <w:szCs w:val="28"/>
-        </w:rPr>
-        <w:t xml:space="preserve"> firewall add rule name="</w:t>
-      </w:r>
-      <w:proofErr w:type="spellStart"/>
-      <w:r>
-        <w:rPr>
-          <w:rFonts w:cstheme="minorHAnsi"/>
-          <w:sz w:val="28"/>
-          <w:szCs w:val="28"/>
-        </w:rPr>
-        <w:t>Block_Kali_ICMP</w:t>
-      </w:r>
-      <w:proofErr w:type="spellEnd"/>
-      <w:r>
-        <w:rPr>
-          <w:rFonts w:cstheme="minorHAnsi"/>
-          <w:sz w:val="28"/>
-          <w:szCs w:val="28"/>
-        </w:rPr>
-        <w:t xml:space="preserve">" protocol=icmpv4:8,any </w:t>
-      </w:r>
-      <w:proofErr w:type="spellStart"/>
-      <w:r>
-        <w:rPr>
-          <w:rFonts w:cstheme="minorHAnsi"/>
-          <w:sz w:val="28"/>
-          <w:szCs w:val="28"/>
-        </w:rPr>
-        <w:t>dir</w:t>
-      </w:r>
-      <w:proofErr w:type="spellEnd"/>
-      <w:r>
-        <w:rPr>
-          <w:rFonts w:cstheme="minorHAnsi"/>
-          <w:sz w:val="28"/>
-          <w:szCs w:val="28"/>
-        </w:rPr>
-        <w:t xml:space="preserve">=in </w:t>
-      </w:r>
-      <w:proofErr w:type="spellStart"/>
-      <w:r>
-        <w:rPr>
-          <w:rFonts w:cstheme="minorHAnsi"/>
-          <w:sz w:val="28"/>
-          <w:szCs w:val="28"/>
-        </w:rPr>
-        <w:t>remoteip</w:t>
-      </w:r>
-      <w:proofErr w:type="spellEnd"/>
-      <w:r>
-        <w:rPr>
-          <w:rFonts w:cstheme="minorHAnsi"/>
-          <w:sz w:val="28"/>
-          <w:szCs w:val="28"/>
-        </w:rPr>
-        <w:t>=150.1.7.101 action=block</w:t>
+      <w:r>
+        <w:rPr>
+          <w:rFonts w:cstheme="minorHAnsi"/>
+          <w:sz w:val="28"/>
+          <w:szCs w:val="28"/>
+        </w:rPr>
+        <w:t>netsh advfirewall firewall add rule name="Block_Kali_ICMP" protocol=icmpv4:8,any dir=in remoteip=150.1.7.101 action=block</w:t>
       </w:r>
     </w:p>
     <w:p>
@@ -2316,7 +1773,7 @@
                     </pic:cNvPicPr>
                   </pic:nvPicPr>
                   <pic:blipFill>
-                    <a:blip r:embed="rId16">
+                    <a:blip r:embed="rId15">
                       <a:extLst>
                         <a:ext uri="{28A0092B-C50C-407E-A947-70E740481C1C}">
                           <a14:useLocalDpi xmlns:a14="http://schemas.microsoft.com/office/drawing/2010/main" val="0"/>
@@ -2379,7 +1836,7 @@
                     </pic:cNvPicPr>
                   </pic:nvPicPr>
                   <pic:blipFill>
-                    <a:blip r:embed="rId17">
+                    <a:blip r:embed="rId16">
                       <a:extLst>
                         <a:ext uri="{28A0092B-C50C-407E-A947-70E740481C1C}">
                           <a14:useLocalDpi xmlns:a14="http://schemas.microsoft.com/office/drawing/2010/main" val="0"/>
@@ -2474,7 +1931,7 @@
                     </pic:cNvPicPr>
                   </pic:nvPicPr>
                   <pic:blipFill>
-                    <a:blip r:embed="rId18">
+                    <a:blip r:embed="rId17">
                       <a:extLst>
                         <a:ext uri="{28A0092B-C50C-407E-A947-70E740481C1C}">
                           <a14:useLocalDpi xmlns:a14="http://schemas.microsoft.com/office/drawing/2010/main" val="0"/>
@@ -2639,29 +2096,7 @@
           <w:sz w:val="28"/>
           <w:szCs w:val="28"/>
         </w:rPr>
-        <w:t xml:space="preserve">police </w:t>
-      </w:r>
-      <w:proofErr w:type="spellStart"/>
-      <w:r>
-        <w:rPr>
-          <w:rFonts w:ascii="Times New Roman" w:hAnsi="Times New Roman" w:cs="Times New Roman"/>
-          <w:b/>
-          <w:bCs/>
-          <w:sz w:val="28"/>
-          <w:szCs w:val="28"/>
-        </w:rPr>
-        <w:t>cir</w:t>
-      </w:r>
-      <w:proofErr w:type="spellEnd"/>
-      <w:r>
-        <w:rPr>
-          <w:rFonts w:ascii="Times New Roman" w:hAnsi="Times New Roman" w:cs="Times New Roman"/>
-          <w:b/>
-          <w:bCs/>
-          <w:sz w:val="28"/>
-          <w:szCs w:val="28"/>
-        </w:rPr>
-        <w:t xml:space="preserve"> 8000 conform-action transmit exceed-action drop</w:t>
+        <w:t>police cir 8000 conform-action transmit exceed-action drop</w:t>
       </w:r>
     </w:p>
     <w:p>

</xml_diff>